<commit_message>
Apply reviewer feedback: 4 fixes to combo paper + cover letter
1. Supplementary list: add Table S9 (hypothesis testing matrix),
   expand S-figure descriptions with key statistics
2. Native zone: add three-signal convergence description (GC dip,
   GC skew inflection, GMM clustering)
3. ENC paradox: add one sentence on Mimivirus stronger bias despite
   worse host adaptation
4. Cover letter: mention compositional landscape, gene families,
   and protein structure findings for expanded scope

Co-Authored-By: Claude Opus 4.6 <noreply@anthropic.com>
</commit_message>
<xml_diff>
--- a/docs/Pandoravirus_combo_paper_draft3.docx
+++ b/docs/Pandoravirus_combo_paper_draft3.docx
@@ -1343,7 +1343,7 @@
         <w:t xml:space="preserve"> </w:t>
       </w:r>
       <w:r>
-        <w:t xml:space="preserve">host translation machinery than Mimivirus (CAI 0.787 vs 0.657). Critically, ORFan genes were compositionally indistinguishable from annotated genes across all codon metrics: GC3 difference +0.015, ENC difference -1.03, CAI difference +0.008, and upstream 6-mer cosine similarity 0.9824 (Table S1). If the 92.5% ORFan fraction had been recently acquired through horizontal gene transfer from diverse sources, these genes would carry the codon signatures of their origins. Instead, the compositional homogeneity indicates either ancient residency with full equilibration or de novo origin within the genome.</w:t>
+        <w:t xml:space="preserve">host translation machinery than Mimivirus (CAI 0.787 vs 0.657). Paradoxically, Mimivirus shows stronger codon bias (ENC 41.6 vs 45.6) despite worse host adaptation, possibly because its poorly matched tRNA complement forces concentration on a narrow subset of usable codons. Critically, ORFan genes were compositionally indistinguishable from annotated genes across all codon metrics: GC3 difference +0.015, ENC difference -1.03, CAI difference +0.008, and upstream 6-mer cosine similarity 0.9824 (Table S1). If the 92.5% ORFan fraction had been recently acquired through horizontal gene transfer from diverse sources, these genes would carry the codon signatures of their origins. Instead, the compositional homogeneity indicates either ancient residency with full equilibration or de novo origin within the genome.</w:t>
       </w:r>
     </w:p>
     <w:p>
@@ -1376,7 +1376,7 @@
         <w:t xml:space="preserve"> </w:t>
       </w:r>
       <w:r>
-        <w:t xml:space="preserve">intergenic fraction from 32.5% to approximately 23.8%, suggesting the genome encodes more genes than currently annotated. The native zone (1.3-2.0 Mb), identified independently by a GC content dip visible in sliding-window profiles, showed a higher confirmation rate (96.0% vs 92.4%) and lower hypothetical fraction (55.2% vs 66.2%) than the rest of the genome – it is better annotated, not a gene desert, and its compositional distinctiveness reflects the coding genes themselves.</w:t>
+        <w:t xml:space="preserve">intergenic fraction from 32.5% to approximately 23.8%, suggesting the genome encodes more genes than currently annotated. The native zone (1.3-2.0 Mb), identified independently by convergence of a GC content dip in sliding-window profiles, a GC skew inflection, and corroborated by GMM clustering, showed a higher confirmation rate (96.0% vs 92.4%) and lower hypothetical fraction (55.2% vs 66.2%) than the rest of the genome – it is better annotated, not a gene desert, and its compositional distinctiveness reflects the coding genes themselves.</w:t>
       </w:r>
     </w:p>
     <w:p>
@@ -1682,7 +1682,7 @@
         <w:pStyle w:val="BodyText"/>
       </w:pPr>
       <w:r>
-        <w:t xml:space="preserve">ESM-2 protein language model embeddings for 170 representative proteins spanning all compositional clusters and proto-gene tiers revealed 9 structural families, in contrast to the 14 compositional families detected by protein 3-mer similarity (Module 7, covering only 3.2% of genes). Null calibration against composition-matched random proteins confirmed that real structural families are significantly tighter than expected by chance (within-family similarity 0.533 vs null 0.368; Cohen’s d = 1.45), although 41% of PC1 variance correlates with GC content, indicating a partial compositional confound. Phase 7 compositional families were validated structurally: 10 of 14 family representatives clustered together alongside known domains (Fascin, ankyrin, kinase, Ubiquitin). Twenty-three ORFan singletons clustered structurally with annotated domain-containing proteins, suggesting deeper homology relationships invisible to sequence-based methods (Table S2). Eight of nine structural families were cross-tier, indicating that structural relationships cut across compositional categories – proteins with different GC content, annotation status, and cluster assignments share structural embedding features.</w:t>
+        <w:t xml:space="preserve">ESM-2 protein language model embeddings for 170 representative proteins spanning all compositional clusters and proto-gene tiers revealed 9 structural families, in contrast to the 14 compositional families detected by protein 3-mer similarity (Module 7, covering only 3.2% of genes). Null calibration against composition-matched random proteins confirmed that real structural families are significantly tighter than expected by chance (within-family similarity 0.533 vs null 0.368; Cohen’s d = 1.45), although 41% of PC1 variance correlates with GC content, indicating a partial compositional confound. Module 7 compositional families were validated structurally: 10 of 14 family representatives clustered together alongside known domains (Fascin, ankyrin, kinase, Ubiquitin). Twenty-three ORFan singletons clustered structurally with annotated domain-containing proteins, suggesting deeper homology relationships invisible to sequence-based methods (Table S2). Eight of nine structural families were cross-tier, indicating that structural relationships cut across compositional categories – proteins with different GC content, annotation status, and cluster assignments share structural embedding features.</w:t>
       </w:r>
     </w:p>
     <w:bookmarkEnd w:id="17"/>
@@ -4406,13 +4406,13 @@
           <w:b/>
           <w:bCs/>
         </w:rPr>
-        <w:t xml:space="preserve">Figure S1.</w:t>
-      </w:r>
-      <w:r>
-        <w:t xml:space="preserve"> </w:t>
-      </w:r>
-      <w:r>
-        <w:t xml:space="preserve">Genome architecture: sliding-window GC profiles, gene density maps, and GC skew plots for all four genomes.</w:t>
+        <w:t xml:space="preserve">Table S9.</w:t>
+      </w:r>
+      <w:r>
+        <w:t xml:space="preserve"> </w:t>
+      </w:r>
+      <w:r>
+        <w:t xml:space="preserve">Hypothesis testing matrix: evidentiary status of four genome growth models (HGT, gene duplication, mobile element expansion, de novo gene birth) across all 12 modules, with supporting/disfavoring classification and key statistics for each.</w:t>
       </w:r>
     </w:p>
     <w:p>
@@ -4424,29 +4424,13 @@
           <w:b/>
           <w:bCs/>
         </w:rPr>
-        <w:t xml:space="preserve">Figure S2.</w:t>
-      </w:r>
-      <w:r>
-        <w:t xml:space="preserve"> </w:t>
-      </w:r>
-      <w:r>
-        <w:t xml:space="preserve">GMM clustering of</w:t>
-      </w:r>
-      <w:r>
-        <w:t xml:space="preserve"> </w:t>
-      </w:r>
-      <w:r>
-        <w:rPr>
-          <w:i/>
-          <w:iCs/>
-        </w:rPr>
-        <w:t xml:space="preserve">P. salinus</w:t>
-      </w:r>
-      <w:r>
-        <w:t xml:space="preserve"> </w:t>
-      </w:r>
-      <w:r>
-        <w:t xml:space="preserve">genes: three compositional clusters with native zone overlay.</w:t>
+        <w:t xml:space="preserve">Figure S1.</w:t>
+      </w:r>
+      <w:r>
+        <w:t xml:space="preserve"> </w:t>
+      </w:r>
+      <w:r>
+        <w:t xml:space="preserve">Genome architecture: sliding-window GC profiles, gene density maps, GC skew plots, and strand maps for all four genomes in the comparison ladder.</w:t>
       </w:r>
     </w:p>
     <w:p>
@@ -4458,13 +4442,13 @@
           <w:b/>
           <w:bCs/>
         </w:rPr>
-        <w:t xml:space="preserve">Figure S3.</w:t>
-      </w:r>
-      <w:r>
-        <w:t xml:space="preserve"> </w:t>
-      </w:r>
-      <w:r>
-        <w:t xml:space="preserve">Pairwise protein similarity distributions:</w:t>
+        <w:t xml:space="preserve">Figure S2.</w:t>
+      </w:r>
+      <w:r>
+        <w:t xml:space="preserve"> </w:t>
+      </w:r>
+      <w:r>
+        <w:t xml:space="preserve">GMM clustering of</w:t>
       </w:r>
       <w:r>
         <w:t xml:space="preserve"> </w:t>
@@ -4480,7 +4464,7 @@
         <w:t xml:space="preserve"> </w:t>
       </w:r>
       <w:r>
-        <w:t xml:space="preserve">vs Mimivirus, with null model overlay.</w:t>
+        <w:t xml:space="preserve">genes: three compositional clusters with native zone (1.3-2.0 Mb) overlay, showing cluster composition shift within the zone.</w:t>
       </w:r>
     </w:p>
     <w:p>
@@ -4492,13 +4476,47 @@
           <w:b/>
           <w:bCs/>
         </w:rPr>
+        <w:t xml:space="preserve">Figure S3.</w:t>
+      </w:r>
+      <w:r>
+        <w:t xml:space="preserve"> </w:t>
+      </w:r>
+      <w:r>
+        <w:t xml:space="preserve">Pairwise protein 3-mer cosine similarity distributions:</w:t>
+      </w:r>
+      <w:r>
+        <w:t xml:space="preserve"> </w:t>
+      </w:r>
+      <w:r>
+        <w:rPr>
+          <w:i/>
+          <w:iCs/>
+        </w:rPr>
+        <w:t xml:space="preserve">P. salinus</w:t>
+      </w:r>
+      <w:r>
+        <w:t xml:space="preserve"> </w:t>
+      </w:r>
+      <w:r>
+        <w:t xml:space="preserve">vs Mimivirus, with composition-matched null model overlay demonstrating that the diffuse similarity cloud (mean 0.109) is a compositional artifact (null mean 0.105; Cohen’s d = 0.06).</w:t>
+      </w:r>
+    </w:p>
+    <w:p>
+      <w:pPr>
+        <w:pStyle w:val="BodyText"/>
+      </w:pPr>
+      <w:r>
+        <w:rPr>
+          <w:b/>
+          <w:bCs/>
+        </w:rPr>
         <w:t xml:space="preserve">Figure S4.</w:t>
       </w:r>
       <w:r>
         <w:t xml:space="preserve"> </w:t>
       </w:r>
       <w:r>
-        <w:t xml:space="preserve">ESM-2 PCA embedding space showing structural family assignments, proto-gene positions, and GC content overlay.</w:t>
+        <w:t xml:space="preserve">ESM-2 PCA embedding space showing structural family assignments, proto-gene positions, GC content overlay, and null calibration comparison (within-family similarity 0.533 vs null 0.368; Cohen’s d = 1.45).</w:t>
       </w:r>
     </w:p>
     <w:p>

</xml_diff>